<commit_message>
Polish deliverables: unified design system, styled cover pages, zebra tables, diagram arrows, conditional formatting
</commit_message>
<xml_diff>
--- a/deliverables/Administration-Guide.docx
+++ b/deliverables/Administration-Guide.docx
@@ -4,200 +4,46 @@
   <w:body>
     <w:p>
       <w:pPr>
-        <w:pStyle w:val="Title"/>
+        <w:spacing w:after="40"/>
       </w:pPr>
       <w:r>
+        <w:rPr>
+          <w:b/>
+          <w:color w:val="00AAD2"/>
+          <w:sz w:val="26"/>
+        </w:rPr>
+        <w:t>HMSG (Hyundai Motorsport GmbH) — WEC Racing</w:t>
+      </w:r>
+    </w:p>
+    <w:p>
+      <w:pPr>
+        <w:spacing w:before="360" w:after="120"/>
+        <w:pBdr>
+          <w:bottom w:val="single" w:sz="18" w:space="4" w:color="F5A623"/>
+        </w:pBdr>
+      </w:pPr>
+      <w:r>
+        <w:rPr>
+          <w:b/>
+          <w:color w:val="002C5F"/>
+          <w:sz w:val="52"/>
+        </w:rPr>
         <w:t>Administration Guide</w:t>
       </w:r>
     </w:p>
     <w:p>
       <w:r>
-        <w:t>HMSG WEC Racing PRD - operational guide for the Windows MSSQL host, Client VPN, and Site-to-Site VPN.</w:t>
+        <w:rPr>
+          <w:color w:val="595959"/>
+          <w:sz w:val="25"/>
+        </w:rPr>
+        <w:t>Operating the HMSG WEC Racing production environment</w:t>
       </w:r>
     </w:p>
     <w:p>
       <w:pPr>
-        <w:pStyle w:val="Heading1"/>
+        <w:spacing w:after="40"/>
       </w:pPr>
-      <w:r>
-        <w:t>1. Scope</w:t>
-      </w:r>
-    </w:p>
-    <w:p>
-      <w:r>
-        <w:t>This guide covers day-2 access, basic operations, and handover responsibilities for the HMSG WEC Racing PRD environment.</w:t>
-      </w:r>
-    </w:p>
-    <w:p>
-      <w:pPr>
-        <w:pStyle w:val="Heading1"/>
-      </w:pPr>
-      <w:r>
-        <w:t>2. Key Access Paths</w:t>
-      </w:r>
-    </w:p>
-    <w:tbl>
-      <w:tblPr>
-        <w:tblStyle w:val="TableGrid"/>
-        <w:tblW w:type="auto" w:w="0"/>
-        <w:tblLook w:firstColumn="1" w:firstRow="1" w:lastColumn="0" w:lastRow="0" w:noHBand="0" w:noVBand="1" w:val="04A0"/>
-      </w:tblPr>
-      <w:tblGrid>
-        <w:gridCol w:w="2880"/>
-        <w:gridCol w:w="2880"/>
-        <w:gridCol w:w="2880"/>
-      </w:tblGrid>
-      <w:tr>
-        <w:tc>
-          <w:tcPr>
-            <w:tcW w:type="dxa" w:w="2880"/>
-            <w:shd w:fill="1F4E78"/>
-          </w:tcPr>
-          <w:p>
-            <w:r>
-              <w:rPr>
-                <w:b/>
-                <w:color w:val="FFFFFF"/>
-              </w:rPr>
-              <w:t>Path</w:t>
-            </w:r>
-          </w:p>
-        </w:tc>
-        <w:tc>
-          <w:tcPr>
-            <w:tcW w:type="dxa" w:w="2880"/>
-            <w:shd w:fill="1F4E78"/>
-          </w:tcPr>
-          <w:p>
-            <w:r>
-              <w:rPr>
-                <w:b/>
-                <w:color w:val="FFFFFF"/>
-              </w:rPr>
-              <w:t>How to use it</w:t>
-            </w:r>
-          </w:p>
-        </w:tc>
-        <w:tc>
-          <w:tcPr>
-            <w:tcW w:type="dxa" w:w="2880"/>
-            <w:shd w:fill="1F4E78"/>
-          </w:tcPr>
-          <w:p>
-            <w:r>
-              <w:rPr>
-                <w:b/>
-                <w:color w:val="FFFFFF"/>
-              </w:rPr>
-              <w:t>Notes</w:t>
-            </w:r>
-          </w:p>
-        </w:tc>
-      </w:tr>
-      <w:tr>
-        <w:tc>
-          <w:tcPr>
-            <w:tcW w:type="dxa" w:w="2880"/>
-          </w:tcPr>
-          <w:p>
-            <w:r>
-              <w:t>AWS Client VPN</w:t>
-            </w:r>
-          </w:p>
-        </w:tc>
-        <w:tc>
-          <w:tcPr>
-            <w:tcW w:type="dxa" w:w="2880"/>
-          </w:tcPr>
-          <w:p>
-            <w:r>
-              <w:t>Connect with the .ovpn file and Entra ID SSO</w:t>
-            </w:r>
-          </w:p>
-        </w:tc>
-        <w:tc>
-          <w:tcPr>
-            <w:tcW w:type="dxa" w:w="2880"/>
-          </w:tcPr>
-          <w:p>
-            <w:r>
-              <w:t>Primary developer access path</w:t>
-            </w:r>
-          </w:p>
-        </w:tc>
-      </w:tr>
-      <w:tr>
-        <w:tc>
-          <w:tcPr>
-            <w:tcW w:type="dxa" w:w="2880"/>
-          </w:tcPr>
-          <w:p>
-            <w:r>
-              <w:t>RDP to EC2</w:t>
-            </w:r>
-          </w:p>
-        </w:tc>
-        <w:tc>
-          <w:tcPr>
-            <w:tcW w:type="dxa" w:w="2880"/>
-          </w:tcPr>
-          <w:p>
-            <w:r>
-              <w:t>Use sysadm via Client VPN to reach the private IP</w:t>
-            </w:r>
-          </w:p>
-        </w:tc>
-        <w:tc>
-          <w:tcPr>
-            <w:tcW w:type="dxa" w:w="2880"/>
-          </w:tcPr>
-          <w:p>
-            <w:r>
-              <w:t>No public IP is assigned</w:t>
-            </w:r>
-          </w:p>
-        </w:tc>
-      </w:tr>
-      <w:tr>
-        <w:tc>
-          <w:tcPr>
-            <w:tcW w:type="dxa" w:w="2880"/>
-          </w:tcPr>
-          <w:p>
-            <w:r>
-              <w:t>SSM Session Manager</w:t>
-            </w:r>
-          </w:p>
-        </w:tc>
-        <w:tc>
-          <w:tcPr>
-            <w:tcW w:type="dxa" w:w="2880"/>
-          </w:tcPr>
-          <w:p>
-            <w:r>
-              <w:t>Use the instance profile and VPC endpoints</w:t>
-            </w:r>
-          </w:p>
-        </w:tc>
-        <w:tc>
-          <w:tcPr>
-            <w:tcW w:type="dxa" w:w="2880"/>
-          </w:tcPr>
-          <w:p>
-            <w:r>
-              <w:t>Backup access path when RDP is unavailable</w:t>
-            </w:r>
-          </w:p>
-        </w:tc>
-      </w:tr>
-    </w:tbl>
-    <w:p>
-      <w:pPr>
-        <w:pStyle w:val="Heading1"/>
-      </w:pPr>
-      <w:r>
-        <w:t>3. Key Resources</w:t>
-      </w:r>
     </w:p>
     <w:tbl>
       <w:tblPr>
@@ -212,14 +58,730 @@
       <w:tr>
         <w:tc>
           <w:tcPr>
-            <w:tcW w:type="dxa" w:w="4320"/>
-            <w:shd w:fill="1F4E78"/>
+            <w:tcW w:type="dxa" w:w="8496"/>
+            <w:shd w:val="clear" w:fill="002C5F"/>
           </w:tcPr>
           <w:p>
+            <w:r/>
             <w:r>
               <w:rPr>
                 <w:b/>
                 <w:color w:val="FFFFFF"/>
+                <w:sz w:val="20"/>
+              </w:rPr>
+              <w:t>Document</w:t>
+            </w:r>
+          </w:p>
+        </w:tc>
+        <w:tc>
+          <w:tcPr>
+            <w:tcW w:type="dxa" w:w="8496"/>
+          </w:tcPr>
+          <w:p>
+            <w:r/>
+            <w:r>
+              <w:rPr>
+                <w:b/>
+                <w:sz w:val="20"/>
+              </w:rPr>
+              <w:t>Administration Guide</w:t>
+            </w:r>
+          </w:p>
+        </w:tc>
+      </w:tr>
+      <w:tr>
+        <w:tc>
+          <w:tcPr>
+            <w:tcW w:type="dxa" w:w="8496"/>
+            <w:shd w:val="clear" w:fill="002C5F"/>
+          </w:tcPr>
+          <w:p>
+            <w:r/>
+            <w:r>
+              <w:rPr>
+                <w:b/>
+                <w:color w:val="FFFFFF"/>
+                <w:sz w:val="20"/>
+              </w:rPr>
+              <w:t>Document</w:t>
+            </w:r>
+          </w:p>
+        </w:tc>
+        <w:tc>
+          <w:tcPr>
+            <w:tcW w:type="dxa" w:w="8496"/>
+          </w:tcPr>
+          <w:p>
+            <w:r/>
+            <w:r>
+              <w:rPr>
+                <w:b/>
+                <w:sz w:val="20"/>
+              </w:rPr>
+            </w:r>
+          </w:p>
+        </w:tc>
+      </w:tr>
+      <w:tr>
+        <w:tc>
+          <w:tcPr>
+            <w:tcW w:type="dxa" w:w="8496"/>
+            <w:shd w:val="clear" w:fill="002C5F"/>
+          </w:tcPr>
+          <w:p>
+            <w:r/>
+            <w:r>
+              <w:rPr>
+                <w:b/>
+                <w:color w:val="FFFFFF"/>
+                <w:sz w:val="20"/>
+              </w:rPr>
+              <w:t>Project</w:t>
+            </w:r>
+          </w:p>
+        </w:tc>
+        <w:tc>
+          <w:tcPr>
+            <w:tcW w:type="dxa" w:w="8496"/>
+          </w:tcPr>
+          <w:p>
+            <w:r/>
+            <w:r>
+              <w:rPr>
+                <w:b/>
+                <w:sz w:val="20"/>
+              </w:rPr>
+              <w:t>HMSG (Hyundai Motorsport GmbH) — WEC Racing</w:t>
+            </w:r>
+          </w:p>
+        </w:tc>
+      </w:tr>
+      <w:tr>
+        <w:tc>
+          <w:tcPr>
+            <w:tcW w:type="dxa" w:w="8496"/>
+            <w:shd w:val="clear" w:fill="002C5F"/>
+          </w:tcPr>
+          <w:p>
+            <w:r/>
+            <w:r>
+              <w:rPr>
+                <w:b/>
+                <w:color w:val="FFFFFF"/>
+                <w:sz w:val="20"/>
+              </w:rPr>
+              <w:t>Environment / Region</w:t>
+            </w:r>
+          </w:p>
+        </w:tc>
+        <w:tc>
+          <w:tcPr>
+            <w:tcW w:type="dxa" w:w="8496"/>
+          </w:tcPr>
+          <w:p>
+            <w:r/>
+            <w:r>
+              <w:rPr>
+                <w:sz w:val="20"/>
+              </w:rPr>
+              <w:t>prd · eu-central-1 (Frankfurt)</w:t>
+            </w:r>
+          </w:p>
+        </w:tc>
+      </w:tr>
+      <w:tr>
+        <w:tc>
+          <w:tcPr>
+            <w:tcW w:type="dxa" w:w="8496"/>
+            <w:shd w:val="clear" w:fill="002C5F"/>
+          </w:tcPr>
+          <w:p>
+            <w:r/>
+            <w:r>
+              <w:rPr>
+                <w:b/>
+                <w:color w:val="FFFFFF"/>
+                <w:sz w:val="20"/>
+              </w:rPr>
+              <w:t>Stack</w:t>
+            </w:r>
+          </w:p>
+        </w:tc>
+        <w:tc>
+          <w:tcPr>
+            <w:tcW w:type="dxa" w:w="8496"/>
+          </w:tcPr>
+          <w:p>
+            <w:r/>
+            <w:r>
+              <w:rPr>
+                <w:sz w:val="20"/>
+              </w:rPr>
+              <w:t>hmsg-rac-prd</w:t>
+            </w:r>
+          </w:p>
+        </w:tc>
+      </w:tr>
+      <w:tr>
+        <w:tc>
+          <w:tcPr>
+            <w:tcW w:type="dxa" w:w="8496"/>
+            <w:shd w:val="clear" w:fill="002C5F"/>
+          </w:tcPr>
+          <w:p>
+            <w:r/>
+            <w:r>
+              <w:rPr>
+                <w:b/>
+                <w:color w:val="FFFFFF"/>
+                <w:sz w:val="20"/>
+              </w:rPr>
+              <w:t>Version</w:t>
+            </w:r>
+          </w:p>
+        </w:tc>
+        <w:tc>
+          <w:tcPr>
+            <w:tcW w:type="dxa" w:w="8496"/>
+          </w:tcPr>
+          <w:p>
+            <w:r/>
+            <w:r>
+              <w:rPr>
+                <w:sz w:val="20"/>
+              </w:rPr>
+              <w:t>1.0</w:t>
+            </w:r>
+          </w:p>
+        </w:tc>
+      </w:tr>
+      <w:tr>
+        <w:tc>
+          <w:tcPr>
+            <w:tcW w:type="dxa" w:w="8496"/>
+            <w:shd w:val="clear" w:fill="002C5F"/>
+          </w:tcPr>
+          <w:p>
+            <w:r/>
+            <w:r>
+              <w:rPr>
+                <w:b/>
+                <w:color w:val="FFFFFF"/>
+                <w:sz w:val="20"/>
+              </w:rPr>
+              <w:t>Date</w:t>
+            </w:r>
+          </w:p>
+        </w:tc>
+        <w:tc>
+          <w:tcPr>
+            <w:tcW w:type="dxa" w:w="8496"/>
+          </w:tcPr>
+          <w:p>
+            <w:r/>
+            <w:r>
+              <w:rPr>
+                <w:sz w:val="20"/>
+              </w:rPr>
+              <w:t>19 August 2026</w:t>
+            </w:r>
+          </w:p>
+        </w:tc>
+      </w:tr>
+      <w:tr>
+        <w:tc>
+          <w:tcPr>
+            <w:tcW w:type="dxa" w:w="8496"/>
+            <w:shd w:val="clear" w:fill="002C5F"/>
+          </w:tcPr>
+          <w:p>
+            <w:r/>
+            <w:r>
+              <w:rPr>
+                <w:b/>
+                <w:color w:val="FFFFFF"/>
+                <w:sz w:val="20"/>
+              </w:rPr>
+              <w:t>Owner</w:t>
+            </w:r>
+          </w:p>
+        </w:tc>
+        <w:tc>
+          <w:tcPr>
+            <w:tcW w:type="dxa" w:w="8496"/>
+          </w:tcPr>
+          <w:p>
+            <w:r/>
+            <w:r>
+              <w:rPr>
+                <w:sz w:val="20"/>
+              </w:rPr>
+              <w:t>HAEE Cloud Team</w:t>
+            </w:r>
+          </w:p>
+        </w:tc>
+      </w:tr>
+      <w:tr>
+        <w:tc>
+          <w:tcPr>
+            <w:tcW w:type="dxa" w:w="8496"/>
+            <w:shd w:val="clear" w:fill="002C5F"/>
+          </w:tcPr>
+          <w:p>
+            <w:r/>
+            <w:r>
+              <w:rPr>
+                <w:b/>
+                <w:color w:val="FFFFFF"/>
+                <w:sz w:val="20"/>
+              </w:rPr>
+              <w:t>Status</w:t>
+            </w:r>
+          </w:p>
+        </w:tc>
+        <w:tc>
+          <w:tcPr>
+            <w:tcW w:type="dxa" w:w="8496"/>
+          </w:tcPr>
+          <w:p>
+            <w:r/>
+            <w:r>
+              <w:rPr>
+                <w:sz w:val="20"/>
+              </w:rPr>
+              <w:t>Draft — for review</w:t>
+            </w:r>
+          </w:p>
+        </w:tc>
+      </w:tr>
+      <w:tr>
+        <w:tc>
+          <w:tcPr>
+            <w:tcW w:type="dxa" w:w="8496"/>
+            <w:shd w:val="clear" w:fill="002C5F"/>
+          </w:tcPr>
+          <w:p>
+            <w:r/>
+            <w:r>
+              <w:rPr>
+                <w:b/>
+                <w:color w:val="FFFFFF"/>
+                <w:sz w:val="20"/>
+              </w:rPr>
+              <w:t>Related</w:t>
+            </w:r>
+          </w:p>
+        </w:tc>
+        <w:tc>
+          <w:tcPr>
+            <w:tcW w:type="dxa" w:w="8496"/>
+          </w:tcPr>
+          <w:p>
+            <w:r/>
+            <w:r>
+              <w:rPr>
+                <w:sz w:val="20"/>
+              </w:rPr>
+              <w:t>sub Documents in the deliverables folder</w:t>
+            </w:r>
+          </w:p>
+        </w:tc>
+      </w:tr>
+      <w:tr>
+        <w:tc>
+          <w:tcPr>
+            <w:tcW w:type="dxa" w:w="8496"/>
+            <w:shd w:val="clear" w:fill="002C5F"/>
+          </w:tcPr>
+          <w:p>
+            <w:r/>
+            <w:r>
+              <w:rPr>
+                <w:b/>
+                <w:color w:val="FFFFFF"/>
+                <w:sz w:val="20"/>
+              </w:rPr>
+              <w:t>Baseline</w:t>
+            </w:r>
+          </w:p>
+        </w:tc>
+        <w:tc>
+          <w:tcPr>
+            <w:tcW w:type="dxa" w:w="8496"/>
+          </w:tcPr>
+          <w:p>
+            <w:r/>
+            <w:r>
+              <w:rPr>
+                <w:sz w:val="20"/>
+              </w:rPr>
+              <w:t>main @ def9a32</w:t>
+            </w:r>
+          </w:p>
+        </w:tc>
+      </w:tr>
+    </w:tbl>
+    <w:p>
+      <w:r>
+        <w:br w:type="page"/>
+      </w:r>
+    </w:p>
+    <w:p>
+      <w:pPr>
+        <w:pStyle w:val="Heading1"/>
+      </w:pPr>
+      <w:r>
+        <w:t>1. Purpose &amp; scope</w:t>
+      </w:r>
+    </w:p>
+    <w:p>
+      <w:pPr>
+        <w:spacing w:after="120"/>
+      </w:pPr>
+      <w:r>
+        <w:t>Day-2 guide for operating the HMSG WEC Racing production environment: the Windows MSSQL host, AWS Client VPN access, and (when enabled) the Site-to-Site VPN.</w:t>
+      </w:r>
+    </w:p>
+    <w:p>
+      <w:pPr>
+        <w:pStyle w:val="Heading1"/>
+      </w:pPr>
+      <w:r>
+        <w:t>2. Access paths</w:t>
+      </w:r>
+    </w:p>
+    <w:tbl>
+      <w:tblPr>
+        <w:tblStyle w:val="TableGrid"/>
+        <w:tblW w:type="auto" w:w="0"/>
+        <w:jc w:val="center"/>
+        <w:tblLook w:firstColumn="1" w:firstRow="1" w:lastColumn="0" w:lastRow="0" w:noHBand="0" w:noVBand="1" w:val="04A0"/>
+      </w:tblPr>
+      <w:tblGrid>
+        <w:gridCol w:w="3216"/>
+        <w:gridCol w:w="3216"/>
+        <w:gridCol w:w="3216"/>
+      </w:tblGrid>
+      <w:tr>
+        <w:tc>
+          <w:tcPr>
+            <w:tcW w:type="dxa" w:w="2304"/>
+            <w:shd w:val="clear" w:fill="002C5F"/>
+          </w:tcPr>
+          <w:p>
+            <w:pPr>
+              <w:spacing w:before="20" w:after="20"/>
+            </w:pPr>
+            <w:r/>
+            <w:r>
+              <w:rPr>
+                <w:b/>
+                <w:color w:val="FFFFFF"/>
+                <w:sz w:val="21"/>
+              </w:rPr>
+              <w:t>Path</w:t>
+            </w:r>
+          </w:p>
+        </w:tc>
+        <w:tc>
+          <w:tcPr>
+            <w:tcW w:type="dxa" w:w="4896"/>
+            <w:shd w:val="clear" w:fill="002C5F"/>
+          </w:tcPr>
+          <w:p>
+            <w:pPr>
+              <w:spacing w:before="20" w:after="20"/>
+            </w:pPr>
+            <w:r/>
+            <w:r>
+              <w:rPr>
+                <w:b/>
+                <w:color w:val="FFFFFF"/>
+                <w:sz w:val="21"/>
+              </w:rPr>
+              <w:t>How to use</w:t>
+            </w:r>
+          </w:p>
+        </w:tc>
+        <w:tc>
+          <w:tcPr>
+            <w:tcW w:type="dxa" w:w="3600"/>
+            <w:shd w:val="clear" w:fill="002C5F"/>
+          </w:tcPr>
+          <w:p>
+            <w:pPr>
+              <w:spacing w:before="20" w:after="20"/>
+            </w:pPr>
+            <w:r/>
+            <w:r>
+              <w:rPr>
+                <w:b/>
+                <w:color w:val="FFFFFF"/>
+                <w:sz w:val="21"/>
+              </w:rPr>
+              <w:t>Notes</w:t>
+            </w:r>
+          </w:p>
+        </w:tc>
+      </w:tr>
+      <w:tr>
+        <w:tc>
+          <w:tcPr>
+            <w:tcW w:type="dxa" w:w="2304"/>
+          </w:tcPr>
+          <w:p>
+            <w:pPr>
+              <w:spacing w:before="20" w:after="20"/>
+            </w:pPr>
+            <w:r/>
+            <w:r>
+              <w:rPr>
+                <w:b/>
+                <w:sz w:val="20"/>
+              </w:rPr>
+              <w:t>AWS Client VPN</w:t>
+            </w:r>
+          </w:p>
+        </w:tc>
+        <w:tc>
+          <w:tcPr>
+            <w:tcW w:type="dxa" w:w="4896"/>
+          </w:tcPr>
+          <w:p>
+            <w:pPr>
+              <w:spacing w:before="20" w:after="20"/>
+            </w:pPr>
+            <w:r/>
+            <w:r>
+              <w:rPr>
+                <w:sz w:val="20"/>
+              </w:rPr>
+              <w:t>Open the .ovpn file (AWS supplied client) and sign in with Entra ID SSO</w:t>
+            </w:r>
+          </w:p>
+        </w:tc>
+        <w:tc>
+          <w:tcPr>
+            <w:tcW w:type="dxa" w:w="3600"/>
+          </w:tcPr>
+          <w:p>
+            <w:pPr>
+              <w:spacing w:before="20" w:after="20"/>
+            </w:pPr>
+            <w:r/>
+            <w:r>
+              <w:rPr>
+                <w:sz w:val="20"/>
+              </w:rPr>
+              <w:t>Primary access for developers (≤10 users)</w:t>
+            </w:r>
+          </w:p>
+        </w:tc>
+      </w:tr>
+      <w:tr>
+        <w:tc>
+          <w:tcPr>
+            <w:tcW w:type="dxa" w:w="2304"/>
+            <w:shd w:val="clear" w:fill="F2F7FB"/>
+          </w:tcPr>
+          <w:p>
+            <w:pPr>
+              <w:spacing w:before="20" w:after="20"/>
+            </w:pPr>
+            <w:r/>
+            <w:r>
+              <w:rPr>
+                <w:b/>
+                <w:sz w:val="20"/>
+              </w:rPr>
+              <w:t>RDP to EC2</w:t>
+            </w:r>
+          </w:p>
+        </w:tc>
+        <w:tc>
+          <w:tcPr>
+            <w:tcW w:type="dxa" w:w="4896"/>
+            <w:shd w:val="clear" w:fill="F2F7FB"/>
+          </w:tcPr>
+          <w:p>
+            <w:pPr>
+              <w:spacing w:before="20" w:after="20"/>
+            </w:pPr>
+            <w:r/>
+            <w:r>
+              <w:rPr>
+                <w:sz w:val="20"/>
+              </w:rPr>
+              <w:t>mstsc → MssqlPrivateIp (172.200.0.128–159 range) with sysadm</w:t>
+            </w:r>
+          </w:p>
+        </w:tc>
+        <w:tc>
+          <w:tcPr>
+            <w:tcW w:type="dxa" w:w="3600"/>
+            <w:shd w:val="clear" w:fill="F2F7FB"/>
+          </w:tcPr>
+          <w:p>
+            <w:pPr>
+              <w:spacing w:before="20" w:after="20"/>
+            </w:pPr>
+            <w:r/>
+            <w:r>
+              <w:rPr>
+                <w:sz w:val="20"/>
+              </w:rPr>
+              <w:t>Only reachable through Client VPN / on-prem — no public IP</w:t>
+            </w:r>
+          </w:p>
+        </w:tc>
+      </w:tr>
+      <w:tr>
+        <w:tc>
+          <w:tcPr>
+            <w:tcW w:type="dxa" w:w="2304"/>
+          </w:tcPr>
+          <w:p>
+            <w:pPr>
+              <w:spacing w:before="20" w:after="20"/>
+            </w:pPr>
+            <w:r/>
+            <w:r>
+              <w:rPr>
+                <w:b/>
+                <w:sz w:val="20"/>
+              </w:rPr>
+              <w:t>SSM Session Manager</w:t>
+            </w:r>
+          </w:p>
+        </w:tc>
+        <w:tc>
+          <w:tcPr>
+            <w:tcW w:type="dxa" w:w="4896"/>
+          </w:tcPr>
+          <w:p>
+            <w:pPr>
+              <w:spacing w:before="20" w:after="20"/>
+            </w:pPr>
+            <w:r/>
+            <w:r>
+              <w:rPr>
+                <w:sz w:val="20"/>
+              </w:rPr>
+              <w:t>EC2 console or aws ssm start-session; uses the instance profile</w:t>
+            </w:r>
+          </w:p>
+        </w:tc>
+        <w:tc>
+          <w:tcPr>
+            <w:tcW w:type="dxa" w:w="3600"/>
+          </w:tcPr>
+          <w:p>
+            <w:pPr>
+              <w:spacing w:before="20" w:after="20"/>
+            </w:pPr>
+            <w:r/>
+            <w:r>
+              <w:rPr>
+                <w:sz w:val="20"/>
+              </w:rPr>
+              <w:t>Backup access when RDP is unavailable</w:t>
+            </w:r>
+          </w:p>
+        </w:tc>
+      </w:tr>
+      <w:tr>
+        <w:tc>
+          <w:tcPr>
+            <w:tcW w:type="dxa" w:w="2304"/>
+            <w:shd w:val="clear" w:fill="F2F7FB"/>
+          </w:tcPr>
+          <w:p>
+            <w:pPr>
+              <w:spacing w:before="20" w:after="20"/>
+            </w:pPr>
+            <w:r/>
+            <w:r>
+              <w:rPr>
+                <w:b/>
+                <w:sz w:val="20"/>
+              </w:rPr>
+              <w:t>AWS console / CLI</w:t>
+            </w:r>
+          </w:p>
+        </w:tc>
+        <w:tc>
+          <w:tcPr>
+            <w:tcW w:type="dxa" w:w="4896"/>
+            <w:shd w:val="clear" w:fill="F2F7FB"/>
+          </w:tcPr>
+          <w:p>
+            <w:pPr>
+              <w:spacing w:before="20" w:after="20"/>
+            </w:pPr>
+            <w:r/>
+            <w:r>
+              <w:rPr>
+                <w:sz w:val="20"/>
+              </w:rPr>
+              <w:t>AWS account 440027026402, eu-central-1, stack hmsg-rac-prd</w:t>
+            </w:r>
+          </w:p>
+        </w:tc>
+        <w:tc>
+          <w:tcPr>
+            <w:tcW w:type="dxa" w:w="3600"/>
+            <w:shd w:val="clear" w:fill="F2F7FB"/>
+          </w:tcPr>
+          <w:p>
+            <w:pPr>
+              <w:spacing w:before="20" w:after="20"/>
+            </w:pPr>
+            <w:r/>
+            <w:r>
+              <w:rPr>
+                <w:sz w:val="20"/>
+              </w:rPr>
+              <w:t>Operations and troubleshooting</w:t>
+            </w:r>
+          </w:p>
+        </w:tc>
+      </w:tr>
+    </w:tbl>
+    <w:p>
+      <w:pPr>
+        <w:pStyle w:val="Heading1"/>
+      </w:pPr>
+      <w:r>
+        <w:t>3. Key resources</w:t>
+      </w:r>
+    </w:p>
+    <w:tbl>
+      <w:tblPr>
+        <w:tblStyle w:val="TableGrid"/>
+        <w:tblW w:type="auto" w:w="0"/>
+        <w:jc w:val="center"/>
+        <w:tblLook w:firstColumn="1" w:firstRow="1" w:lastColumn="0" w:lastRow="0" w:noHBand="0" w:noVBand="1" w:val="04A0"/>
+      </w:tblPr>
+      <w:tblGrid>
+        <w:gridCol w:w="4824"/>
+        <w:gridCol w:w="4824"/>
+      </w:tblGrid>
+      <w:tr>
+        <w:tc>
+          <w:tcPr>
+            <w:tcW w:type="dxa" w:w="4464"/>
+            <w:shd w:val="clear" w:fill="002C5F"/>
+          </w:tcPr>
+          <w:p>
+            <w:pPr>
+              <w:spacing w:before="20" w:after="20"/>
+            </w:pPr>
+            <w:r/>
+            <w:r>
+              <w:rPr>
+                <w:b/>
+                <w:color w:val="FFFFFF"/>
+                <w:sz w:val="21"/>
               </w:rPr>
               <w:t>Resource</w:t>
             </w:r>
@@ -227,16 +789,352 @@
         </w:tc>
         <w:tc>
           <w:tcPr>
-            <w:tcW w:type="dxa" w:w="4320"/>
-            <w:shd w:fill="1F4E78"/>
+            <w:tcW w:type="dxa" w:w="6336"/>
+            <w:shd w:val="clear" w:fill="002C5F"/>
           </w:tcPr>
           <w:p>
+            <w:pPr>
+              <w:spacing w:before="20" w:after="20"/>
+            </w:pPr>
+            <w:r/>
             <w:r>
               <w:rPr>
                 <w:b/>
                 <w:color w:val="FFFFFF"/>
+                <w:sz w:val="21"/>
               </w:rPr>
-              <w:t>Purpose</w:t>
+              <w:t>What it is</w:t>
+            </w:r>
+          </w:p>
+        </w:tc>
+      </w:tr>
+      <w:tr>
+        <w:tc>
+          <w:tcPr>
+            <w:tcW w:type="dxa" w:w="4464"/>
+          </w:tcPr>
+          <w:p>
+            <w:pPr>
+              <w:spacing w:before="20" w:after="20"/>
+            </w:pPr>
+            <w:r/>
+            <w:r>
+              <w:rPr>
+                <w:b/>
+                <w:sz w:val="20"/>
+              </w:rPr>
+              <w:t>hmsg-rac-prd-vpc-ec1</w:t>
+            </w:r>
+          </w:p>
+        </w:tc>
+        <w:tc>
+          <w:tcPr>
+            <w:tcW w:type="dxa" w:w="6336"/>
+          </w:tcPr>
+          <w:p>
+            <w:pPr>
+              <w:spacing w:before="20" w:after="20"/>
+            </w:pPr>
+            <w:r/>
+            <w:r>
+              <w:rPr>
+                <w:sz w:val="20"/>
+              </w:rPr>
+              <w:t>VPC 172.200.0.0/24 — dual-AZ public / private / DB subnets</w:t>
+            </w:r>
+          </w:p>
+        </w:tc>
+      </w:tr>
+      <w:tr>
+        <w:tc>
+          <w:tcPr>
+            <w:tcW w:type="dxa" w:w="4464"/>
+            <w:shd w:val="clear" w:fill="F2F7FB"/>
+          </w:tcPr>
+          <w:p>
+            <w:pPr>
+              <w:spacing w:before="20" w:after="20"/>
+            </w:pPr>
+            <w:r/>
+            <w:r>
+              <w:rPr>
+                <w:b/>
+                <w:sz w:val="20"/>
+              </w:rPr>
+              <w:t>hmsg-rac-prd-mssql01-ec2-ec1a</w:t>
+            </w:r>
+          </w:p>
+        </w:tc>
+        <w:tc>
+          <w:tcPr>
+            <w:tcW w:type="dxa" w:w="6336"/>
+            <w:shd w:val="clear" w:fill="F2F7FB"/>
+          </w:tcPr>
+          <w:p>
+            <w:pPr>
+              <w:spacing w:before="20" w:after="20"/>
+            </w:pPr>
+            <w:r/>
+            <w:r>
+              <w:rPr>
+                <w:sz w:val="20"/>
+              </w:rPr>
+              <w:t>Windows Server 2022 (m7i.2xlarge) — 250 GB root + 4 TB D: data volume</w:t>
+            </w:r>
+          </w:p>
+        </w:tc>
+      </w:tr>
+      <w:tr>
+        <w:tc>
+          <w:tcPr>
+            <w:tcW w:type="dxa" w:w="4464"/>
+          </w:tcPr>
+          <w:p>
+            <w:pPr>
+              <w:spacing w:before="20" w:after="20"/>
+            </w:pPr>
+            <w:r/>
+            <w:r>
+              <w:rPr>
+                <w:b/>
+                <w:sz w:val="20"/>
+              </w:rPr>
+              <w:t>hmsg-rac-prd-clientvpn-ec1</w:t>
+            </w:r>
+          </w:p>
+        </w:tc>
+        <w:tc>
+          <w:tcPr>
+            <w:tcW w:type="dxa" w:w="6336"/>
+          </w:tcPr>
+          <w:p>
+            <w:pPr>
+              <w:spacing w:before="20" w:after="20"/>
+            </w:pPr>
+            <w:r/>
+            <w:r>
+              <w:rPr>
+                <w:sz w:val="20"/>
+              </w:rPr>
+              <w:t>Client VPN endpoint — SAML (Entra ID) auth, UDP 443, split tunnel</w:t>
+            </w:r>
+          </w:p>
+        </w:tc>
+      </w:tr>
+      <w:tr>
+        <w:tc>
+          <w:tcPr>
+            <w:tcW w:type="dxa" w:w="4464"/>
+            <w:shd w:val="clear" w:fill="F2F7FB"/>
+          </w:tcPr>
+          <w:p>
+            <w:pPr>
+              <w:spacing w:before="20" w:after="20"/>
+            </w:pPr>
+            <w:r/>
+            <w:r>
+              <w:rPr>
+                <w:b/>
+                <w:sz w:val="20"/>
+              </w:rPr>
+              <w:t>hmsg-rac-prd-vpn-conn-ec1</w:t>
+            </w:r>
+          </w:p>
+        </w:tc>
+        <w:tc>
+          <w:tcPr>
+            <w:tcW w:type="dxa" w:w="6336"/>
+            <w:shd w:val="clear" w:fill="F2F7FB"/>
+          </w:tcPr>
+          <w:p>
+            <w:pPr>
+              <w:spacing w:before="20" w:after="20"/>
+            </w:pPr>
+            <w:r/>
+            <w:r>
+              <w:rPr>
+                <w:sz w:val="20"/>
+              </w:rPr>
+              <w:t>Site-to-Site VPN (optional) — static route to the on-prem network</w:t>
+            </w:r>
+          </w:p>
+        </w:tc>
+      </w:tr>
+      <w:tr>
+        <w:tc>
+          <w:tcPr>
+            <w:tcW w:type="dxa" w:w="4464"/>
+          </w:tcPr>
+          <w:p>
+            <w:pPr>
+              <w:spacing w:before="20" w:after="20"/>
+            </w:pPr>
+            <w:r/>
+            <w:r>
+              <w:rPr>
+                <w:b/>
+                <w:sz w:val="20"/>
+              </w:rPr>
+              <w:t>hmsg-rac-prd-sysadm-password</w:t>
+            </w:r>
+          </w:p>
+        </w:tc>
+        <w:tc>
+          <w:tcPr>
+            <w:tcW w:type="dxa" w:w="6336"/>
+          </w:tcPr>
+          <w:p>
+            <w:pPr>
+              <w:spacing w:before="20" w:after="20"/>
+            </w:pPr>
+            <w:r/>
+            <w:r>
+              <w:rPr>
+                <w:sz w:val="20"/>
+              </w:rPr>
+              <w:t>Secrets Manager secret — sysadm local administrator password</w:t>
+            </w:r>
+          </w:p>
+        </w:tc>
+      </w:tr>
+    </w:tbl>
+    <w:p>
+      <w:pPr>
+        <w:pStyle w:val="Heading1"/>
+      </w:pPr>
+      <w:r>
+        <w:t>4. Operating rules</w:t>
+      </w:r>
+    </w:p>
+    <w:p>
+      <w:pPr>
+        <w:pStyle w:val="ListBullet"/>
+        <w:spacing w:after="40"/>
+      </w:pPr>
+      <w:r>
+        <w:rPr>
+          <w:sz w:val="21"/>
+        </w:rPr>
+        <w:t>UserData runs only at first boot: rotate sysadm by changing the Windows password on the host first, then update the secret.</w:t>
+      </w:r>
+    </w:p>
+    <w:p>
+      <w:pPr>
+        <w:pStyle w:val="ListBullet"/>
+        <w:spacing w:after="40"/>
+      </w:pPr>
+      <w:r>
+        <w:rPr>
+          <w:sz w:val="21"/>
+        </w:rPr>
+        <w:t>The DB subnet has no internet route by design — AWS APIs are only reachable through the VPC interface endpoints.</w:t>
+      </w:r>
+    </w:p>
+    <w:p>
+      <w:pPr>
+        <w:pStyle w:val="ListBullet"/>
+        <w:spacing w:after="40"/>
+      </w:pPr>
+      <w:r>
+        <w:rPr>
+          <w:sz w:val="21"/>
+        </w:rPr>
+        <w:t>Do not attach a public IP to the EC2 instance.</w:t>
+      </w:r>
+    </w:p>
+    <w:p>
+      <w:pPr>
+        <w:pStyle w:val="ListBullet"/>
+        <w:spacing w:after="40"/>
+      </w:pPr>
+      <w:r>
+        <w:rPr>
+          <w:sz w:val="21"/>
+        </w:rPr>
+        <w:t>Entra ID application and user management are client-owned after handover.</w:t>
+      </w:r>
+    </w:p>
+    <w:p>
+      <w:pPr>
+        <w:pStyle w:val="ListBullet"/>
+        <w:spacing w:after="40"/>
+      </w:pPr>
+      <w:r>
+        <w:rPr>
+          <w:sz w:val="21"/>
+        </w:rPr>
+        <w:t>Temporary implementation IAM permissions are removed at project completion.</w:t>
+      </w:r>
+    </w:p>
+    <w:p>
+      <w:pPr>
+        <w:pStyle w:val="ListBullet"/>
+        <w:spacing w:after="40"/>
+      </w:pPr>
+      <w:r>
+        <w:rPr>
+          <w:sz w:val="21"/>
+        </w:rPr>
+        <w:t>Flow logs: VPC → S3 (Glacier after 30 days, expiry after 365 days). Client VPN → CloudWatch (90 days).</w:t>
+      </w:r>
+    </w:p>
+    <w:p>
+      <w:pPr>
+        <w:pStyle w:val="Heading1"/>
+      </w:pPr>
+      <w:r>
+        <w:t>5. Routine checks</w:t>
+      </w:r>
+    </w:p>
+    <w:tbl>
+      <w:tblPr>
+        <w:tblStyle w:val="TableGrid"/>
+        <w:tblW w:type="auto" w:w="0"/>
+        <w:jc w:val="center"/>
+        <w:tblLook w:firstColumn="1" w:firstRow="1" w:lastColumn="0" w:lastRow="0" w:noHBand="0" w:noVBand="1" w:val="04A0"/>
+      </w:tblPr>
+      <w:tblGrid>
+        <w:gridCol w:w="4824"/>
+        <w:gridCol w:w="4824"/>
+      </w:tblGrid>
+      <w:tr>
+        <w:tc>
+          <w:tcPr>
+            <w:tcW w:type="dxa" w:w="4320"/>
+            <w:shd w:val="clear" w:fill="002C5F"/>
+          </w:tcPr>
+          <w:p>
+            <w:pPr>
+              <w:spacing w:before="20" w:after="20"/>
+            </w:pPr>
+            <w:r/>
+            <w:r>
+              <w:rPr>
+                <w:b/>
+                <w:color w:val="FFFFFF"/>
+                <w:sz w:val="21"/>
+              </w:rPr>
+              <w:t>Check</w:t>
+            </w:r>
+          </w:p>
+        </w:tc>
+        <w:tc>
+          <w:tcPr>
+            <w:tcW w:type="dxa" w:w="6480"/>
+            <w:shd w:val="clear" w:fill="002C5F"/>
+          </w:tcPr>
+          <w:p>
+            <w:pPr>
+              <w:spacing w:before="20" w:after="20"/>
+            </w:pPr>
+            <w:r/>
+            <w:r>
+              <w:rPr>
+                <w:b/>
+                <w:color w:val="FFFFFF"/>
+                <w:sz w:val="21"/>
+              </w:rPr>
+              <w:t>Expected</w:t>
             </w:r>
           </w:p>
         </w:tc>
@@ -247,18 +1145,72 @@
             <w:tcW w:type="dxa" w:w="4320"/>
           </w:tcPr>
           <w:p>
+            <w:pPr>
+              <w:spacing w:before="20" w:after="20"/>
+            </w:pPr>
+            <w:r/>
             <w:r>
-              <w:t>VPC</w:t>
+              <w:rPr>
+                <w:b/>
+                <w:sz w:val="20"/>
+              </w:rPr>
+              <w:t>Client VPN endpoint state</w:t>
             </w:r>
           </w:p>
         </w:tc>
         <w:tc>
           <w:tcPr>
-            <w:tcW w:type="dxa" w:w="4320"/>
+            <w:tcW w:type="dxa" w:w="6480"/>
           </w:tcPr>
           <w:p>
+            <w:pPr>
+              <w:spacing w:before="20" w:after="20"/>
+            </w:pPr>
+            <w:r/>
             <w:r>
-              <w:t>172.200.0.0/24 network with dual-AZ public/private/DB subnets</w:t>
+              <w:rPr>
+                <w:sz w:val="20"/>
+              </w:rPr>
+              <w:t>available; clients connect via Entra ID SSO</w:t>
+            </w:r>
+          </w:p>
+        </w:tc>
+      </w:tr>
+      <w:tr>
+        <w:tc>
+          <w:tcPr>
+            <w:tcW w:type="dxa" w:w="4320"/>
+            <w:shd w:val="clear" w:fill="F2F7FB"/>
+          </w:tcPr>
+          <w:p>
+            <w:pPr>
+              <w:spacing w:before="20" w:after="20"/>
+            </w:pPr>
+            <w:r/>
+            <w:r>
+              <w:rPr>
+                <w:b/>
+                <w:sz w:val="20"/>
+              </w:rPr>
+              <w:t>4 TB data volume</w:t>
+            </w:r>
+          </w:p>
+        </w:tc>
+        <w:tc>
+          <w:tcPr>
+            <w:tcW w:type="dxa" w:w="6480"/>
+            <w:shd w:val="clear" w:fill="F2F7FB"/>
+          </w:tcPr>
+          <w:p>
+            <w:pPr>
+              <w:spacing w:before="20" w:after="20"/>
+            </w:pPr>
+            <w:r/>
+            <w:r>
+              <w:rPr>
+                <w:sz w:val="20"/>
+              </w:rPr>
+              <w:t>Mounted as D:, NTFS, label SQLData, at least 20% free for SQL growth</w:t>
             </w:r>
           </w:p>
         </w:tc>
@@ -269,18 +1221,72 @@
             <w:tcW w:type="dxa" w:w="4320"/>
           </w:tcPr>
           <w:p>
+            <w:pPr>
+              <w:spacing w:before="20" w:after="20"/>
+            </w:pPr>
+            <w:r/>
             <w:r>
-              <w:t>EC2 MSSQL host</w:t>
+              <w:rPr>
+                <w:b/>
+                <w:sz w:val="20"/>
+              </w:rPr>
+              <w:t>Port 1433 reachability</w:t>
             </w:r>
           </w:p>
         </w:tc>
         <w:tc>
           <w:tcPr>
-            <w:tcW w:type="dxa" w:w="4320"/>
+            <w:tcW w:type="dxa" w:w="6480"/>
           </w:tcPr>
           <w:p>
+            <w:pPr>
+              <w:spacing w:before="20" w:after="20"/>
+            </w:pPr>
+            <w:r/>
             <w:r>
-              <w:t>Windows Server 2022, m7i.2xlarge, 250GB root + 4TB data</w:t>
+              <w:rPr>
+                <w:sz w:val="20"/>
+              </w:rPr>
+              <w:t>Allowed from 10.200.0.0/22 (and on-prem CIDR when the S2S VPN exists)</w:t>
+            </w:r>
+          </w:p>
+        </w:tc>
+      </w:tr>
+      <w:tr>
+        <w:tc>
+          <w:tcPr>
+            <w:tcW w:type="dxa" w:w="4320"/>
+            <w:shd w:val="clear" w:fill="F2F7FB"/>
+          </w:tcPr>
+          <w:p>
+            <w:pPr>
+              <w:spacing w:before="20" w:after="20"/>
+            </w:pPr>
+            <w:r/>
+            <w:r>
+              <w:rPr>
+                <w:b/>
+                <w:sz w:val="20"/>
+              </w:rPr>
+              <w:t>Site-to-Site tunnel state</w:t>
+            </w:r>
+          </w:p>
+        </w:tc>
+        <w:tc>
+          <w:tcPr>
+            <w:tcW w:type="dxa" w:w="6480"/>
+            <w:shd w:val="clear" w:fill="F2F7FB"/>
+          </w:tcPr>
+          <w:p>
+            <w:pPr>
+              <w:spacing w:before="20" w:after="20"/>
+            </w:pPr>
+            <w:r/>
+            <w:r>
+              <w:rPr>
+                <w:sz w:val="20"/>
+              </w:rPr>
+              <w:t>UP on both ends; route advertised in pri/db route tables</w:t>
             </w:r>
           </w:p>
         </w:tc>
@@ -291,62 +1297,33 @@
             <w:tcW w:type="dxa" w:w="4320"/>
           </w:tcPr>
           <w:p>
+            <w:pPr>
+              <w:spacing w:before="20" w:after="20"/>
+            </w:pPr>
+            <w:r/>
             <w:r>
-              <w:t>Client VPN</w:t>
+              <w:rPr>
+                <w:b/>
+                <w:sz w:val="20"/>
+              </w:rPr>
+              <w:t>Secrets Manager secret</w:t>
             </w:r>
           </w:p>
         </w:tc>
         <w:tc>
           <w:tcPr>
-            <w:tcW w:type="dxa" w:w="4320"/>
+            <w:tcW w:type="dxa" w:w="6480"/>
           </w:tcPr>
           <w:p>
+            <w:pPr>
+              <w:spacing w:before="20" w:after="20"/>
+            </w:pPr>
+            <w:r/>
             <w:r>
-              <w:t>SAML / Entra ID access for developers</w:t>
-            </w:r>
-          </w:p>
-        </w:tc>
-      </w:tr>
-      <w:tr>
-        <w:tc>
-          <w:tcPr>
-            <w:tcW w:type="dxa" w:w="4320"/>
-          </w:tcPr>
-          <w:p>
-            <w:r>
-              <w:t>Site-to-Site VPN</w:t>
-            </w:r>
-          </w:p>
-        </w:tc>
-        <w:tc>
-          <w:tcPr>
-            <w:tcW w:type="dxa" w:w="4320"/>
-          </w:tcPr>
-          <w:p>
-            <w:r>
-              <w:t>Optional on-prem connectivity when client values are supplied</w:t>
-            </w:r>
-          </w:p>
-        </w:tc>
-      </w:tr>
-      <w:tr>
-        <w:tc>
-          <w:tcPr>
-            <w:tcW w:type="dxa" w:w="4320"/>
-          </w:tcPr>
-          <w:p>
-            <w:r>
-              <w:t>Secrets Manager</w:t>
-            </w:r>
-          </w:p>
-        </w:tc>
-        <w:tc>
-          <w:tcPr>
-            <w:tcW w:type="dxa" w:w="4320"/>
-          </w:tcPr>
-          <w:p>
-            <w:r>
-              <w:t>Stores the sysadm password</w:t>
+              <w:rPr>
+                <w:sz w:val="20"/>
+              </w:rPr>
+              <w:t>Matches the current Windows password</w:t>
             </w:r>
           </w:p>
         </w:tc>
@@ -357,110 +1334,71 @@
         <w:pStyle w:val="Heading1"/>
       </w:pPr>
       <w:r>
-        <w:t>4. Operating Rules</w:t>
+        <w:t>6. Handover</w:t>
       </w:r>
     </w:p>
     <w:p>
       <w:pPr>
-        <w:pStyle w:val="ListBullet"/>
+        <w:spacing w:after="120"/>
       </w:pPr>
       <w:r>
-        <w:t>Keep the sysadm password in sync with the Windows local account; UserData only runs at first boot.</w:t>
+        <w:t>At project completion: deliver the documentation set, remove temporary IAM access, transfer VPN user administration to HMGRS / the client, and obtain sign-off.</w:t>
       </w:r>
     </w:p>
     <w:p>
       <w:pPr>
-        <w:pStyle w:val="ListBullet"/>
+        <w:spacing w:before="80"/>
       </w:pPr>
       <w:r>
-        <w:t>The DB subnet has no internet route by design; AWS APIs are reached through VPC endpoints only.</w:t>
-      </w:r>
-    </w:p>
-    <w:p>
-      <w:pPr>
-        <w:pStyle w:val="ListBullet"/>
-      </w:pPr>
-      <w:r>
-        <w:t>Do not assign public IPs to the EC2 instance.</w:t>
-      </w:r>
-    </w:p>
-    <w:p>
-      <w:pPr>
-        <w:pStyle w:val="ListBullet"/>
-      </w:pPr>
-      <w:r>
-        <w:t>Entra ID user management is client-owned after handover.</w:t>
-      </w:r>
-    </w:p>
-    <w:p>
-      <w:pPr>
-        <w:pStyle w:val="ListBullet"/>
-      </w:pPr>
-      <w:r>
-        <w:t>Temporary implementation IAM permissions must be removed at project completion.</w:t>
-      </w:r>
-    </w:p>
-    <w:p>
-      <w:pPr>
-        <w:pStyle w:val="Heading1"/>
-      </w:pPr>
-      <w:r>
-        <w:t>5. Common Checks</w:t>
-      </w:r>
-    </w:p>
-    <w:p>
-      <w:pPr>
-        <w:pStyle w:val="ListBullet"/>
-      </w:pPr>
-      <w:r>
-        <w:t>Confirm the client VPN endpoint is up and the SAML app is configured.</w:t>
-      </w:r>
-    </w:p>
-    <w:p>
-      <w:pPr>
-        <w:pStyle w:val="ListBullet"/>
-      </w:pPr>
-      <w:r>
-        <w:t>Confirm the 4 TB data volume is mounted as D: and available for SQL data.</w:t>
-      </w:r>
-    </w:p>
-    <w:p>
-      <w:pPr>
-        <w:pStyle w:val="ListBullet"/>
-      </w:pPr>
-      <w:r>
-        <w:t>Confirm port 1433 is allowed from the Client VPN CIDR and, when enabled, the on-prem CIDR.</w:t>
-      </w:r>
-    </w:p>
-    <w:p>
-      <w:pPr>
-        <w:pStyle w:val="ListBullet"/>
-      </w:pPr>
-      <w:r>
-        <w:t>Confirm the site-to-site route is propagated if the optional VPN is deployed.</w:t>
-      </w:r>
-    </w:p>
-    <w:p>
-      <w:pPr>
-        <w:pStyle w:val="Heading1"/>
-      </w:pPr>
-      <w:r>
-        <w:t>6. Handover</w:t>
-      </w:r>
-    </w:p>
-    <w:p>
-      <w:r>
-        <w:t>At project completion, hand over the deliverables folder, close temporary IAM access, and transfer VPN user administration to HMGRS / the client team.</w:t>
+        <w:rPr>
+          <w:i/>
+          <w:color w:val="595959"/>
+          <w:sz w:val="20"/>
+        </w:rPr>
+        <w:t>Prepare for handover: export Security Group rules, route tables and endpoint IDs from the resource inventory workbook before transferring ownership.</w:t>
       </w:r>
     </w:p>
     <w:sectPr>
+      <w:footerReference w:type="default" r:id="rId9"/>
       <w:pgSz w:w="12240" w:h="15840"/>
-      <w:pgMar w:top="1440" w:right="1800" w:bottom="1440" w:left="1800" w:header="720" w:footer="720" w:gutter="0"/>
+      <w:pgMar w:top="1152" w:right="1296" w:bottom="1152" w:left="1296" w:header="720" w:footer="720" w:gutter="0"/>
       <w:cols w:space="720"/>
+      <w:titlePg/>
       <w:docGrid w:linePitch="360"/>
     </w:sectPr>
   </w:body>
 </w:document>
+</file>
+
+<file path=word/footer1.xml><?xml version="1.0" encoding="utf-8"?>
+<w:ftr xmlns:m="http://schemas.openxmlformats.org/officeDocument/2006/math" xmlns:mc="http://schemas.openxmlformats.org/markup-compatibility/2006" xmlns:mo="http://schemas.microsoft.com/office/mac/office/2008/main" xmlns:mv="urn:schemas-microsoft-com:mac:vml" xmlns:o="urn:schemas-microsoft-com:office:office" xmlns:r="http://schemas.openxmlformats.org/officeDocument/2006/relationships" xmlns:v="urn:schemas-microsoft-com:vml" xmlns:w10="urn:schemas-microsoft-com:office:word" xmlns:w14="http://schemas.microsoft.com/office/word/2010/wordml" xmlns:w="http://schemas.openxmlformats.org/wordprocessingml/2006/main" xmlns:wne="http://schemas.microsoft.com/office/word/2006/wordml" xmlns:wp14="http://schemas.microsoft.com/office/word/2010/wordprocessingDrawing" xmlns:wp="http://schemas.openxmlformats.org/drawingml/2006/wordprocessingDrawing" xmlns:wpc="http://schemas.microsoft.com/office/word/2010/wordprocessingCanvas" xmlns:wpg="http://schemas.microsoft.com/office/word/2010/wordprocessingGroup" xmlns:wpi="http://schemas.microsoft.com/office/word/2010/wordprocessingInk" xmlns:wps="http://schemas.microsoft.com/office/word/2010/wordprocessingShape" mc:Ignorable="w14 wp14">
+  <w:p>
+    <w:pPr>
+      <w:pStyle w:val="Footer"/>
+      <w:tabs>
+        <w:tab w:pos="10080" w:val="right"/>
+      </w:tabs>
+    </w:pPr>
+    <w:r>
+      <w:rPr>
+        <w:color w:val="99A7B4"/>
+        <w:sz w:val="17"/>
+      </w:rPr>
+      <w:t>HMSG WEC Racing — PRD · Administration Guide</w:t>
+    </w:r>
+    <w:r>
+      <w:tab/>
+    </w:r>
+    <w:fldSimple w:instr="PAGE">
+      <w:r>
+        <w:rPr>
+          <w:sz w:val="18"/>
+        </w:rPr>
+        <w:t>1</w:t>
+      </w:r>
+    </w:fldSimple>
+  </w:p>
+</w:ftr>
 </file>
 
 <file path=word/numbering.xml><?xml version="1.0" encoding="utf-8"?>
@@ -826,6 +1764,11 @@
     <w:name w:val="Normal"/>
     <w:qFormat/>
     <w:rsid w:val="00FC693F"/>
+    <w:rPr>
+      <w:rFonts w:ascii="Calibri" w:hAnsi="Calibri"/>
+      <w:color w:val="333333"/>
+      <w:sz w:val="21"/>
+    </w:rPr>
   </w:style>
   <w:style w:type="paragraph" w:styleId="Header">
     <w:name w:val="header"/>
@@ -882,15 +1825,15 @@
     <w:pPr>
       <w:keepNext/>
       <w:keepLines/>
-      <w:spacing w:before="480" w:after="0"/>
+      <w:spacing w:before="280" w:after="80" w:line="252" w:lineRule="auto"/>
       <w:outlineLvl w:val="0"/>
     </w:pPr>
     <w:rPr>
-      <w:rFonts w:asciiTheme="majorHAnsi" w:eastAsiaTheme="majorEastAsia" w:hAnsiTheme="majorHAnsi" w:cstheme="majorBidi"/>
+      <w:rFonts w:asciiTheme="majorHAnsi" w:eastAsiaTheme="majorEastAsia" w:hAnsiTheme="majorHAnsi" w:cstheme="majorBidi" w:ascii="Calibri" w:hAnsi="Calibri"/>
       <w:b/>
       <w:bCs/>
-      <w:color w:val="365F91" w:themeColor="accent1" w:themeShade="BF"/>
-      <w:sz w:val="28"/>
+      <w:color w:val="002C5F"/>
+      <w:sz w:val="30"/>
       <w:szCs w:val="28"/>
     </w:rPr>
   </w:style>
@@ -906,14 +1849,14 @@
     <w:pPr>
       <w:keepNext/>
       <w:keepLines/>
-      <w:spacing w:before="200" w:after="0"/>
+      <w:spacing w:before="160" w:after="80" w:line="252" w:lineRule="auto"/>
       <w:outlineLvl w:val="1"/>
     </w:pPr>
     <w:rPr>
-      <w:rFonts w:asciiTheme="majorHAnsi" w:eastAsiaTheme="majorEastAsia" w:hAnsiTheme="majorHAnsi" w:cstheme="majorBidi"/>
+      <w:rFonts w:asciiTheme="majorHAnsi" w:eastAsiaTheme="majorEastAsia" w:hAnsiTheme="majorHAnsi" w:cstheme="majorBidi" w:ascii="Calibri" w:hAnsi="Calibri"/>
       <w:b/>
       <w:bCs/>
-      <w:color w:val="4F81BD" w:themeColor="accent1"/>
+      <w:color w:val="002C5F"/>
       <w:sz w:val="26"/>
       <w:szCs w:val="26"/>
     </w:rPr>
@@ -930,14 +1873,15 @@
     <w:pPr>
       <w:keepNext/>
       <w:keepLines/>
-      <w:spacing w:before="200" w:after="0"/>
+      <w:spacing w:before="160" w:after="80" w:line="252" w:lineRule="auto"/>
       <w:outlineLvl w:val="2"/>
     </w:pPr>
     <w:rPr>
-      <w:rFonts w:asciiTheme="majorHAnsi" w:eastAsiaTheme="majorEastAsia" w:hAnsiTheme="majorHAnsi" w:cstheme="majorBidi"/>
+      <w:rFonts w:asciiTheme="majorHAnsi" w:eastAsiaTheme="majorEastAsia" w:hAnsiTheme="majorHAnsi" w:cstheme="majorBidi" w:ascii="Calibri" w:hAnsi="Calibri"/>
       <w:b/>
       <w:bCs/>
-      <w:color w:val="4F81BD" w:themeColor="accent1"/>
+      <w:color w:val="002C5F"/>
+      <w:sz w:val="23"/>
     </w:rPr>
   </w:style>
   <w:style w:type="paragraph" w:styleId="Heading4">

</xml_diff>

<commit_message>
Standardize admin installation guide; refresh deliverables
- Administration Guide: new chapter '1. Installation' with validated procedure
  (prerequisites incl. vCPU quota + key pair + Easy-RSA cert import, dry-run,
  deploy, Entra SAML post-step, verification, add-only S2S enablement, teardown);
  add monospace 'code' block renderer; renumber chapters 2-7
- Quick-start: regenerate clean Client-VPN-Quick-Start.docx (38 KB); markdown
  table alignment + hyperlinks
- Regenerate all deliverables (PPTX/XLSX/DOCX)
</commit_message>
<xml_diff>
--- a/deliverables/Administration-Guide.docx
+++ b/deliverables/Administration-Guide.docx
@@ -431,7 +431,1091 @@
         <w:pStyle w:val="Heading1"/>
       </w:pPr>
       <w:r>
-        <w:t>1. Purpose &amp; scope</w:t>
+        <w:t>1. Installation</w:t>
+      </w:r>
+    </w:p>
+    <w:p>
+      <w:pPr>
+        <w:spacing w:after="120"/>
+      </w:pPr>
+      <w:r>
+        <w:t>Standardized installation procedure for the HMSG WEC Racing production environment. Validated end-to-end on the sandbox account and applied to production 440027026402 (eu-central-1 (Frankfurt)). The commands below use the production CLI profile (haee).</w:t>
+      </w:r>
+    </w:p>
+    <w:p>
+      <w:pPr>
+        <w:pStyle w:val="Heading2"/>
+      </w:pPr>
+      <w:r>
+        <w:t>1.1 Prerequisites (check before every fresh install)</w:t>
+      </w:r>
+    </w:p>
+    <w:tbl>
+      <w:tblPr>
+        <w:tblStyle w:val="TableGrid"/>
+        <w:tblW w:type="auto" w:w="0"/>
+        <w:jc w:val="center"/>
+        <w:tblLook w:firstColumn="1" w:firstRow="1" w:lastColumn="0" w:lastRow="0" w:noHBand="0" w:noVBand="1" w:val="04A0"/>
+      </w:tblPr>
+      <w:tblGrid>
+        <w:gridCol w:w="3216"/>
+        <w:gridCol w:w="3216"/>
+        <w:gridCol w:w="3216"/>
+      </w:tblGrid>
+      <w:tr>
+        <w:tc>
+          <w:tcPr>
+            <w:tcW w:type="dxa" w:w="3216"/>
+            <w:shd w:val="clear" w:fill="002C5F"/>
+          </w:tcPr>
+          <w:p>
+            <w:pPr>
+              <w:spacing w:before="20" w:after="20"/>
+            </w:pPr>
+            <w:r/>
+            <w:r>
+              <w:rPr>
+                <w:b/>
+                <w:color w:val="FFFFFF"/>
+                <w:sz w:val="21"/>
+              </w:rPr>
+              <w:t>Prerequisite</w:t>
+            </w:r>
+          </w:p>
+        </w:tc>
+        <w:tc>
+          <w:tcPr>
+            <w:tcW w:type="dxa" w:w="3216"/>
+            <w:shd w:val="clear" w:fill="002C5F"/>
+          </w:tcPr>
+          <w:p>
+            <w:pPr>
+              <w:spacing w:before="20" w:after="20"/>
+            </w:pPr>
+            <w:r/>
+            <w:r>
+              <w:rPr>
+                <w:b/>
+                <w:color w:val="FFFFFF"/>
+                <w:sz w:val="21"/>
+              </w:rPr>
+              <w:t>How to satisfy</w:t>
+            </w:r>
+          </w:p>
+        </w:tc>
+        <w:tc>
+          <w:tcPr>
+            <w:tcW w:type="dxa" w:w="3216"/>
+            <w:shd w:val="clear" w:fill="002C5F"/>
+          </w:tcPr>
+          <w:p>
+            <w:pPr>
+              <w:spacing w:before="20" w:after="20"/>
+            </w:pPr>
+            <w:r/>
+            <w:r>
+              <w:rPr>
+                <w:b/>
+                <w:color w:val="FFFFFF"/>
+                <w:sz w:val="21"/>
+              </w:rPr>
+              <w:t>Notes</w:t>
+            </w:r>
+          </w:p>
+        </w:tc>
+      </w:tr>
+      <w:tr>
+        <w:tc>
+          <w:tcPr>
+            <w:tcW w:type="dxa" w:w="3216"/>
+          </w:tcPr>
+          <w:p>
+            <w:pPr>
+              <w:spacing w:before="20" w:after="20"/>
+            </w:pPr>
+            <w:r/>
+            <w:r>
+              <w:rPr>
+                <w:b/>
+                <w:sz w:val="20"/>
+              </w:rPr>
+              <w:t>Deployer IAM rights</w:t>
+            </w:r>
+          </w:p>
+        </w:tc>
+        <w:tc>
+          <w:tcPr>
+            <w:tcW w:type="dxa" w:w="3216"/>
+          </w:tcPr>
+          <w:p>
+            <w:pPr>
+              <w:spacing w:before="20" w:after="20"/>
+            </w:pPr>
+            <w:r/>
+            <w:r>
+              <w:rPr>
+                <w:sz w:val="20"/>
+              </w:rPr>
+              <w:t>AdministratorAccess (project group)</w:t>
+            </w:r>
+          </w:p>
+        </w:tc>
+        <w:tc>
+          <w:tcPr>
+            <w:tcW w:type="dxa" w:w="3216"/>
+          </w:tcPr>
+          <w:p>
+            <w:pPr>
+              <w:spacing w:before="20" w:after="20"/>
+            </w:pPr>
+            <w:r/>
+            <w:r>
+              <w:rPr>
+                <w:sz w:val="20"/>
+              </w:rPr>
+              <w:t>Required for CloudFormation and CAPABILITY_NAMED_IAM (IAM role / instance profile)</w:t>
+            </w:r>
+          </w:p>
+        </w:tc>
+      </w:tr>
+      <w:tr>
+        <w:tc>
+          <w:tcPr>
+            <w:tcW w:type="dxa" w:w="3216"/>
+            <w:shd w:val="clear" w:fill="F2F7FB"/>
+          </w:tcPr>
+          <w:p>
+            <w:pPr>
+              <w:spacing w:before="20" w:after="20"/>
+            </w:pPr>
+            <w:r/>
+            <w:r>
+              <w:rPr>
+                <w:b/>
+                <w:sz w:val="20"/>
+              </w:rPr>
+              <w:t>Region</w:t>
+            </w:r>
+          </w:p>
+        </w:tc>
+        <w:tc>
+          <w:tcPr>
+            <w:tcW w:type="dxa" w:w="3216"/>
+            <w:shd w:val="clear" w:fill="F2F7FB"/>
+          </w:tcPr>
+          <w:p>
+            <w:pPr>
+              <w:spacing w:before="20" w:after="20"/>
+            </w:pPr>
+            <w:r/>
+            <w:r>
+              <w:rPr>
+                <w:sz w:val="20"/>
+              </w:rPr>
+              <w:t>eu-central-1 (Frankfurt)</w:t>
+            </w:r>
+          </w:p>
+        </w:tc>
+        <w:tc>
+          <w:tcPr>
+            <w:tcW w:type="dxa" w:w="3216"/>
+            <w:shd w:val="clear" w:fill="F2F7FB"/>
+          </w:tcPr>
+          <w:p>
+            <w:pPr>
+              <w:spacing w:before="20" w:after="20"/>
+            </w:pPr>
+            <w:r/>
+            <w:r>
+              <w:rPr>
+                <w:sz w:val="20"/>
+              </w:rPr>
+              <w:t>Key pairs, ACM certs, stacks and quotas are all region-scoped</w:t>
+            </w:r>
+          </w:p>
+        </w:tc>
+      </w:tr>
+      <w:tr>
+        <w:tc>
+          <w:tcPr>
+            <w:tcW w:type="dxa" w:w="3216"/>
+          </w:tcPr>
+          <w:p>
+            <w:pPr>
+              <w:spacing w:before="20" w:after="20"/>
+            </w:pPr>
+            <w:r/>
+            <w:r>
+              <w:rPr>
+                <w:b/>
+                <w:sz w:val="20"/>
+              </w:rPr>
+              <w:t>EC2 key pair hmsg-rac-prd-key-ec2-ec1</w:t>
+            </w:r>
+          </w:p>
+        </w:tc>
+        <w:tc>
+          <w:tcPr>
+            <w:tcW w:type="dxa" w:w="3216"/>
+          </w:tcPr>
+          <w:p>
+            <w:pPr>
+              <w:spacing w:before="20" w:after="20"/>
+            </w:pPr>
+            <w:r/>
+            <w:r>
+              <w:rPr>
+                <w:sz w:val="20"/>
+              </w:rPr>
+              <w:t>aws ec2 create-key-pair (or import-key-pair)</w:t>
+            </w:r>
+          </w:p>
+        </w:tc>
+        <w:tc>
+          <w:tcPr>
+            <w:tcW w:type="dxa" w:w="3216"/>
+          </w:tcPr>
+          <w:p>
+            <w:pPr>
+              <w:spacing w:before="20" w:after="20"/>
+            </w:pPr>
+            <w:r/>
+            <w:r>
+              <w:rPr>
+                <w:sz w:val="20"/>
+              </w:rPr>
+              <w:t>Used to decrypt the Windows Administrator password; keep the .pem private</w:t>
+            </w:r>
+          </w:p>
+        </w:tc>
+      </w:tr>
+      <w:tr>
+        <w:tc>
+          <w:tcPr>
+            <w:tcW w:type="dxa" w:w="3216"/>
+            <w:shd w:val="clear" w:fill="F2F7FB"/>
+          </w:tcPr>
+          <w:p>
+            <w:pPr>
+              <w:spacing w:before="20" w:after="20"/>
+            </w:pPr>
+            <w:r/>
+            <w:r>
+              <w:rPr>
+                <w:b/>
+                <w:sz w:val="20"/>
+              </w:rPr>
+              <w:t>vCPU quota - standard instances</w:t>
+            </w:r>
+          </w:p>
+        </w:tc>
+        <w:tc>
+          <w:tcPr>
+            <w:tcW w:type="dxa" w:w="3216"/>
+            <w:shd w:val="clear" w:fill="F2F7FB"/>
+          </w:tcPr>
+          <w:p>
+            <w:pPr>
+              <w:spacing w:before="20" w:after="20"/>
+            </w:pPr>
+            <w:r/>
+            <w:r>
+              <w:rPr>
+                <w:sz w:val="20"/>
+              </w:rPr>
+              <w:t>Service Quotas: raise 5 to 16 (quota code L-1216C47A)</w:t>
+            </w:r>
+          </w:p>
+        </w:tc>
+        <w:tc>
+          <w:tcPr>
+            <w:tcW w:type="dxa" w:w="3216"/>
+            <w:shd w:val="clear" w:fill="F2F7FB"/>
+          </w:tcPr>
+          <w:p>
+            <w:pPr>
+              <w:spacing w:before="20" w:after="20"/>
+            </w:pPr>
+            <w:r/>
+            <w:r>
+              <w:rPr>
+                <w:sz w:val="20"/>
+              </w:rPr>
+              <w:t>m7i.2xlarge = 8 vCPU; the default unit-5 quota blocks instance creation</w:t>
+            </w:r>
+          </w:p>
+        </w:tc>
+      </w:tr>
+      <w:tr>
+        <w:tc>
+          <w:tcPr>
+            <w:tcW w:type="dxa" w:w="3216"/>
+          </w:tcPr>
+          <w:p>
+            <w:pPr>
+              <w:spacing w:before="20" w:after="20"/>
+            </w:pPr>
+            <w:r/>
+            <w:r>
+              <w:rPr>
+                <w:b/>
+                <w:sz w:val="20"/>
+              </w:rPr>
+              <w:t>ACM server certificate (vpn.hmg-racing.com)</w:t>
+            </w:r>
+          </w:p>
+        </w:tc>
+        <w:tc>
+          <w:tcPr>
+            <w:tcW w:type="dxa" w:w="3216"/>
+          </w:tcPr>
+          <w:p>
+            <w:pPr>
+              <w:spacing w:before="20" w:after="20"/>
+            </w:pPr>
+            <w:r/>
+            <w:r>
+              <w:rPr>
+                <w:sz w:val="20"/>
+              </w:rPr>
+              <w:t>Import the project Easy-RSA cert (private CA), or use a public cert</w:t>
+            </w:r>
+          </w:p>
+        </w:tc>
+        <w:tc>
+          <w:tcPr>
+            <w:tcW w:type="dxa" w:w="3216"/>
+          </w:tcPr>
+          <w:p>
+            <w:pPr>
+              <w:spacing w:before="20" w:after="20"/>
+            </w:pPr>
+            <w:r/>
+            <w:r>
+              <w:rPr>
+                <w:sz w:val="20"/>
+              </w:rPr>
+              <w:t>RSA-2048 only (Client VPN limit). Keep easy-rsa/pki/ - renewal needs the same CA</w:t>
+            </w:r>
+          </w:p>
+        </w:tc>
+      </w:tr>
+      <w:tr>
+        <w:tc>
+          <w:tcPr>
+            <w:tcW w:type="dxa" w:w="3216"/>
+            <w:shd w:val="clear" w:fill="F2F7FB"/>
+          </w:tcPr>
+          <w:p>
+            <w:pPr>
+              <w:spacing w:before="20" w:after="20"/>
+            </w:pPr>
+            <w:r/>
+            <w:r>
+              <w:rPr>
+                <w:b/>
+                <w:sz w:val="20"/>
+              </w:rPr>
+              <w:t>Client on-prem values (optional)</w:t>
+            </w:r>
+          </w:p>
+        </w:tc>
+        <w:tc>
+          <w:tcPr>
+            <w:tcW w:type="dxa" w:w="3216"/>
+            <w:shd w:val="clear" w:fill="F2F7FB"/>
+          </w:tcPr>
+          <w:p>
+            <w:pPr>
+              <w:spacing w:before="20" w:after="20"/>
+            </w:pPr>
+            <w:r/>
+            <w:r>
+              <w:rPr>
+                <w:sz w:val="20"/>
+              </w:rPr>
+              <w:t>deploy with CustomerGatewayIp + OnPremCidr</w:t>
+            </w:r>
+          </w:p>
+        </w:tc>
+        <w:tc>
+          <w:tcPr>
+            <w:tcW w:type="dxa" w:w="3216"/>
+            <w:shd w:val="clear" w:fill="F2F7FB"/>
+          </w:tcPr>
+          <w:p>
+            <w:pPr>
+              <w:spacing w:before="20" w:after="20"/>
+            </w:pPr>
+            <w:r/>
+            <w:r>
+              <w:rPr>
+                <w:sz w:val="20"/>
+              </w:rPr>
+              <w:t>All-or-nothing. Omit both to skip the Site-to-Site VPN; enabling later is add-only</w:t>
+            </w:r>
+          </w:p>
+        </w:tc>
+      </w:tr>
+    </w:tbl>
+    <w:p>
+      <w:pPr>
+        <w:spacing w:before="80"/>
+      </w:pPr>
+      <w:r>
+        <w:rPr>
+          <w:i/>
+          <w:color w:val="595959"/>
+          <w:sz w:val="20"/>
+        </w:rPr>
+        <w:t>Production 440027026402: all prerequisites are in place - key pair created, vCPU quota raised 5 to 16, Easy-RSA certificate imported to ACM.</w:t>
+      </w:r>
+    </w:p>
+    <w:p>
+      <w:pPr>
+        <w:pStyle w:val="Heading2"/>
+      </w:pPr>
+      <w:r>
+        <w:t>1.2 Dry-run review (recommended before every deploy)</w:t>
+      </w:r>
+    </w:p>
+    <w:p>
+      <w:pPr>
+        <w:spacing w:after="40"/>
+        <w:ind w:left="288"/>
+      </w:pPr>
+      <w:r>
+        <w:rPr>
+          <w:rFonts w:ascii="Consolas" w:hAnsi="Consolas"/>
+          <w:color w:val="003366"/>
+          <w:sz w:val="18"/>
+        </w:rPr>
+        <w:t>cd /Users/dda/Downloads/haee</w:t>
+      </w:r>
+    </w:p>
+    <w:p>
+      <w:pPr>
+        <w:spacing w:after="40"/>
+        <w:ind w:left="288"/>
+      </w:pPr>
+      <w:r>
+        <w:rPr>
+          <w:rFonts w:ascii="Consolas" w:hAnsi="Consolas"/>
+          <w:color w:val="003366"/>
+          <w:sz w:val="18"/>
+        </w:rPr>
+        <w:t>aws cloudformation deploy \</w:t>
+      </w:r>
+    </w:p>
+    <w:p>
+      <w:pPr>
+        <w:spacing w:after="40"/>
+        <w:ind w:left="288"/>
+      </w:pPr>
+      <w:r>
+        <w:rPr>
+          <w:rFonts w:ascii="Consolas" w:hAnsi="Consolas"/>
+          <w:color w:val="003366"/>
+          <w:sz w:val="18"/>
+        </w:rPr>
+        <w:t xml:space="preserve">  --template-file hmsg-rac-prd.yaml \</w:t>
+      </w:r>
+    </w:p>
+    <w:p>
+      <w:pPr>
+        <w:spacing w:after="40"/>
+        <w:ind w:left="288"/>
+      </w:pPr>
+      <w:r>
+        <w:rPr>
+          <w:rFonts w:ascii="Consolas" w:hAnsi="Consolas"/>
+          <w:color w:val="003366"/>
+          <w:sz w:val="18"/>
+        </w:rPr>
+        <w:t xml:space="preserve">  --stack-name hmsg-rac-prd \</w:t>
+      </w:r>
+    </w:p>
+    <w:p>
+      <w:pPr>
+        <w:spacing w:after="40"/>
+        <w:ind w:left="288"/>
+      </w:pPr>
+      <w:r>
+        <w:rPr>
+          <w:rFonts w:ascii="Consolas" w:hAnsi="Consolas"/>
+          <w:color w:val="003366"/>
+          <w:sz w:val="18"/>
+        </w:rPr>
+        <w:t xml:space="preserve">  --region eu-central-1 --profile haee \</w:t>
+      </w:r>
+    </w:p>
+    <w:p>
+      <w:pPr>
+        <w:spacing w:after="40"/>
+        <w:ind w:left="288"/>
+      </w:pPr>
+      <w:r>
+        <w:rPr>
+          <w:rFonts w:ascii="Consolas" w:hAnsi="Consolas"/>
+          <w:color w:val="003366"/>
+          <w:sz w:val="18"/>
+        </w:rPr>
+        <w:t xml:space="preserve">  --capabilities CAPABILITY_NAMED_IAM \</w:t>
+      </w:r>
+    </w:p>
+    <w:p>
+      <w:pPr>
+        <w:spacing w:after="40"/>
+        <w:ind w:left="288"/>
+      </w:pPr>
+      <w:r>
+        <w:rPr>
+          <w:rFonts w:ascii="Consolas" w:hAnsi="Consolas"/>
+          <w:color w:val="003366"/>
+          <w:sz w:val="18"/>
+        </w:rPr>
+        <w:t xml:space="preserve">  --parameter-overrides \</w:t>
+      </w:r>
+    </w:p>
+    <w:p>
+      <w:pPr>
+        <w:spacing w:after="40"/>
+        <w:ind w:left="288"/>
+      </w:pPr>
+      <w:r>
+        <w:rPr>
+          <w:rFonts w:ascii="Consolas" w:hAnsi="Consolas"/>
+          <w:color w:val="003366"/>
+          <w:sz w:val="18"/>
+        </w:rPr>
+        <w:t xml:space="preserve">    AdminPassword='&lt;windows-admin-password&gt;' \</w:t>
+      </w:r>
+    </w:p>
+    <w:p>
+      <w:pPr>
+        <w:spacing w:after="40"/>
+        <w:ind w:left="288"/>
+      </w:pPr>
+      <w:r>
+        <w:rPr>
+          <w:rFonts w:ascii="Consolas" w:hAnsi="Consolas"/>
+          <w:color w:val="003366"/>
+          <w:sz w:val="18"/>
+        </w:rPr>
+        <w:t xml:space="preserve">    ServerCertificateArn=arn:aws:acm:eu-central-1:440027026402:certificate/&lt;id&gt; \</w:t>
+      </w:r>
+    </w:p>
+    <w:p>
+      <w:pPr>
+        <w:spacing w:after="40"/>
+        <w:ind w:left="288"/>
+      </w:pPr>
+      <w:r>
+        <w:rPr>
+          <w:rFonts w:ascii="Consolas" w:hAnsi="Consolas"/>
+          <w:color w:val="003366"/>
+          <w:sz w:val="18"/>
+        </w:rPr>
+        <w:t xml:space="preserve">  --no-execute-changeset</w:t>
+      </w:r>
+    </w:p>
+    <w:p>
+      <w:pPr>
+        <w:spacing w:after="120"/>
+      </w:pPr>
+      <w:r>
+        <w:t>Review the change set (aws cloudformation describe-change-set --change-set-name &lt;arn&gt;). Expected on a fresh stack: creates only, no replacements.</w:t>
+      </w:r>
+    </w:p>
+    <w:p>
+      <w:pPr>
+        <w:pStyle w:val="Heading2"/>
+      </w:pPr>
+      <w:r>
+        <w:t>1.3 Deploy</w:t>
+      </w:r>
+    </w:p>
+    <w:p>
+      <w:pPr>
+        <w:spacing w:after="40"/>
+        <w:ind w:left="288"/>
+      </w:pPr>
+      <w:r>
+        <w:rPr>
+          <w:rFonts w:ascii="Consolas" w:hAnsi="Consolas"/>
+          <w:color w:val="003366"/>
+          <w:sz w:val="18"/>
+        </w:rPr>
+        <w:t>aws cloudformation deploy \</w:t>
+      </w:r>
+    </w:p>
+    <w:p>
+      <w:pPr>
+        <w:spacing w:after="40"/>
+        <w:ind w:left="288"/>
+      </w:pPr>
+      <w:r>
+        <w:rPr>
+          <w:rFonts w:ascii="Consolas" w:hAnsi="Consolas"/>
+          <w:color w:val="003366"/>
+          <w:sz w:val="18"/>
+        </w:rPr>
+        <w:t xml:space="preserve">  --template-file hmsg-rac-prd.yaml \</w:t>
+      </w:r>
+    </w:p>
+    <w:p>
+      <w:pPr>
+        <w:spacing w:after="40"/>
+        <w:ind w:left="288"/>
+      </w:pPr>
+      <w:r>
+        <w:rPr>
+          <w:rFonts w:ascii="Consolas" w:hAnsi="Consolas"/>
+          <w:color w:val="003366"/>
+          <w:sz w:val="18"/>
+        </w:rPr>
+        <w:t xml:space="preserve">  --stack-name hmsg-rac-prd \</w:t>
+      </w:r>
+    </w:p>
+    <w:p>
+      <w:pPr>
+        <w:spacing w:after="40"/>
+        <w:ind w:left="288"/>
+      </w:pPr>
+      <w:r>
+        <w:rPr>
+          <w:rFonts w:ascii="Consolas" w:hAnsi="Consolas"/>
+          <w:color w:val="003366"/>
+          <w:sz w:val="18"/>
+        </w:rPr>
+        <w:t xml:space="preserve">  --region eu-central-1 --profile haee \</w:t>
+      </w:r>
+    </w:p>
+    <w:p>
+      <w:pPr>
+        <w:spacing w:after="40"/>
+        <w:ind w:left="288"/>
+      </w:pPr>
+      <w:r>
+        <w:rPr>
+          <w:rFonts w:ascii="Consolas" w:hAnsi="Consolas"/>
+          <w:color w:val="003366"/>
+          <w:sz w:val="18"/>
+        </w:rPr>
+        <w:t xml:space="preserve">  --capabilities CAPABILITY_NAMED_IAM \</w:t>
+      </w:r>
+    </w:p>
+    <w:p>
+      <w:pPr>
+        <w:spacing w:after="40"/>
+        <w:ind w:left="288"/>
+      </w:pPr>
+      <w:r>
+        <w:rPr>
+          <w:rFonts w:ascii="Consolas" w:hAnsi="Consolas"/>
+          <w:color w:val="003366"/>
+          <w:sz w:val="18"/>
+        </w:rPr>
+        <w:t xml:space="preserve">  --parameter-overrides \</w:t>
+      </w:r>
+    </w:p>
+    <w:p>
+      <w:pPr>
+        <w:spacing w:after="40"/>
+        <w:ind w:left="288"/>
+      </w:pPr>
+      <w:r>
+        <w:rPr>
+          <w:rFonts w:ascii="Consolas" w:hAnsi="Consolas"/>
+          <w:color w:val="003366"/>
+          <w:sz w:val="18"/>
+        </w:rPr>
+        <w:t xml:space="preserve">    AdminPassword='&lt;windows-admin-password&gt;' \</w:t>
+      </w:r>
+    </w:p>
+    <w:p>
+      <w:pPr>
+        <w:spacing w:after="40"/>
+        <w:ind w:left="288"/>
+      </w:pPr>
+      <w:r>
+        <w:rPr>
+          <w:rFonts w:ascii="Consolas" w:hAnsi="Consolas"/>
+          <w:color w:val="003366"/>
+          <w:sz w:val="18"/>
+        </w:rPr>
+        <w:t xml:space="preserve">    ServerCertificateArn=arn:aws:acm:eu-central-1:440027026402:certificate/&lt;id&gt;</w:t>
+      </w:r>
+    </w:p>
+    <w:p>
+      <w:pPr>
+        <w:spacing w:before="80"/>
+      </w:pPr>
+      <w:r>
+        <w:rPr>
+          <w:i/>
+          <w:color w:val="800000"/>
+          <w:sz w:val="20"/>
+        </w:rPr>
+        <w:t>AdminPassword is CREATE-ONLY: it must be the password you intend to use on the Windows sysadm account. Changing it later in CloudFormation rewrites the secret but not the OS account - to rotate, follow Operating rules instead.</w:t>
+      </w:r>
+    </w:p>
+    <w:p>
+      <w:pPr>
+        <w:pStyle w:val="Heading2"/>
+      </w:pPr>
+      <w:r>
+        <w:t>1.4 Post-deploy - apply the real Entra ID SAML metadata</w:t>
+      </w:r>
+    </w:p>
+    <w:p>
+      <w:pPr>
+        <w:spacing w:after="120"/>
+      </w:pPr>
+      <w:r>
+        <w:t>The template installs a placeholder SAML document (CloudFormation parameters are capped at 4,096 characters; real Entra ID metadata is ~13 KB). VPN sign-in does NOT work until this command is run with the client's metadata file:</w:t>
+      </w:r>
+    </w:p>
+    <w:p>
+      <w:pPr>
+        <w:spacing w:after="40"/>
+        <w:ind w:left="288"/>
+      </w:pPr>
+      <w:r>
+        <w:rPr>
+          <w:rFonts w:ascii="Consolas" w:hAnsi="Consolas"/>
+          <w:color w:val="003366"/>
+          <w:sz w:val="18"/>
+        </w:rPr>
+        <w:t>aws iam update-saml-provider \</w:t>
+      </w:r>
+    </w:p>
+    <w:p>
+      <w:pPr>
+        <w:spacing w:after="40"/>
+        <w:ind w:left="288"/>
+      </w:pPr>
+      <w:r>
+        <w:rPr>
+          <w:rFonts w:ascii="Consolas" w:hAnsi="Consolas"/>
+          <w:color w:val="003366"/>
+          <w:sz w:val="18"/>
+        </w:rPr>
+        <w:t xml:space="preserve">  --saml-provider-arn &lt;SamlProviderArn from stack outputs&gt; \</w:t>
+      </w:r>
+    </w:p>
+    <w:p>
+      <w:pPr>
+        <w:spacing w:after="40"/>
+        <w:ind w:left="288"/>
+      </w:pPr>
+      <w:r>
+        <w:rPr>
+          <w:rFonts w:ascii="Consolas" w:hAnsi="Consolas"/>
+          <w:color w:val="003366"/>
+          <w:sz w:val="18"/>
+        </w:rPr>
+        <w:t xml:space="preserve">  --saml-metadata-document "file://AWS ClientVPN.xml" --profile haee</w:t>
+      </w:r>
+    </w:p>
+    <w:p>
+      <w:pPr>
+        <w:pStyle w:val="Heading2"/>
+      </w:pPr>
+      <w:r>
+        <w:t>1.5 Verify installation</w:t>
+      </w:r>
+    </w:p>
+    <w:p>
+      <w:pPr>
+        <w:pStyle w:val="ListBullet"/>
+        <w:spacing w:after="40"/>
+      </w:pPr>
+      <w:r>
+        <w:rPr>
+          <w:sz w:val="21"/>
+        </w:rPr>
+        <w:t>Stack status CREATE_COMPLETE, no failed events (aws cloudformation describe-stack-events --stack-name hmsg-rac-prd)</w:t>
+      </w:r>
+    </w:p>
+    <w:p>
+      <w:pPr>
+        <w:pStyle w:val="ListBullet"/>
+        <w:spacing w:after="40"/>
+      </w:pPr>
+      <w:r>
+        <w:rPr>
+          <w:sz w:val="21"/>
+        </w:rPr>
+        <w:t>Outputs present: MssqlInstanceId, MssqlPrivateIp, ClientVpnEndpointId, SamlProviderArn, NatEip, SiteToSiteVpnDeployed</w:t>
+      </w:r>
+    </w:p>
+    <w:p>
+      <w:pPr>
+        <w:pStyle w:val="ListBullet"/>
+        <w:spacing w:after="40"/>
+      </w:pPr>
+      <w:r>
+        <w:rPr>
+          <w:sz w:val="21"/>
+        </w:rPr>
+        <w:t>Instance running (m7i.2xlarge) - aws ec2 describe-instances --instance-ids &lt;MssqlInstanceId&gt;</w:t>
+      </w:r>
+    </w:p>
+    <w:p>
+      <w:pPr>
+        <w:pStyle w:val="ListBullet"/>
+        <w:spacing w:after="40"/>
+      </w:pPr>
+      <w:r>
+        <w:rPr>
+          <w:sz w:val="21"/>
+        </w:rPr>
+        <w:t>Client VPN endpoint available - aws ec2 describe-client-vpn-endpoints --client-vpn-endpoint-ids &lt;id&gt;</w:t>
+      </w:r>
+    </w:p>
+    <w:p>
+      <w:pPr>
+        <w:pStyle w:val="ListBullet"/>
+        <w:spacing w:after="40"/>
+      </w:pPr>
+      <w:r>
+        <w:rPr>
+          <w:sz w:val="21"/>
+        </w:rPr>
+        <w:t>SAML provider resolves to https://sts.windows.net/... (not placeholder.invalid) - aws iam get-saml-provider</w:t>
+      </w:r>
+    </w:p>
+    <w:p>
+      <w:pPr>
+        <w:pStyle w:val="ListBullet"/>
+        <w:spacing w:after="40"/>
+      </w:pPr>
+      <w:r>
+        <w:rPr>
+          <w:sz w:val="21"/>
+        </w:rPr>
+        <w:t>Secret exists - aws secretsmanager get-secret-value --secret-id hmsg-rac-prd-sysadm-password</w:t>
+      </w:r>
+    </w:p>
+    <w:p>
+      <w:pPr>
+        <w:spacing w:before="80"/>
+      </w:pPr>
+      <w:r>
+        <w:rPr>
+          <w:i/>
+          <w:color w:val="595959"/>
+          <w:sz w:val="20"/>
+        </w:rPr>
+        <w:t>Smoke test: sign in through the AWS Client VPN client with the Entra ID account BEFORE distributing the .ovpn bundle.</w:t>
+      </w:r>
+    </w:p>
+    <w:p>
+      <w:pPr>
+        <w:pStyle w:val="Heading2"/>
+      </w:pPr>
+      <w:r>
+        <w:t>1.6 Enabling the Site-to-Site VPN later</w:t>
+      </w:r>
+    </w:p>
+    <w:p>
+      <w:pPr>
+        <w:spacing w:after="120"/>
+      </w:pPr>
+      <w:r>
+        <w:t>When the client supplies both values, re-deploy with ONLY those two overrides - every other parameter is preserved via UsePreviousValue. The update is add-only: +9 resources, 0 modified, 0 replaced.</w:t>
+      </w:r>
+    </w:p>
+    <w:p>
+      <w:pPr>
+        <w:spacing w:after="40"/>
+        <w:ind w:left="288"/>
+      </w:pPr>
+      <w:r>
+        <w:rPr>
+          <w:rFonts w:ascii="Consolas" w:hAnsi="Consolas"/>
+          <w:color w:val="003366"/>
+          <w:sz w:val="18"/>
+        </w:rPr>
+        <w:t>aws cloudformation deploy \</w:t>
+      </w:r>
+    </w:p>
+    <w:p>
+      <w:pPr>
+        <w:spacing w:after="40"/>
+        <w:ind w:left="288"/>
+      </w:pPr>
+      <w:r>
+        <w:rPr>
+          <w:rFonts w:ascii="Consolas" w:hAnsi="Consolas"/>
+          <w:color w:val="003366"/>
+          <w:sz w:val="18"/>
+        </w:rPr>
+        <w:t xml:space="preserve">  --template-file hmsg-rac-prd.yaml \</w:t>
+      </w:r>
+    </w:p>
+    <w:p>
+      <w:pPr>
+        <w:spacing w:after="40"/>
+        <w:ind w:left="288"/>
+      </w:pPr>
+      <w:r>
+        <w:rPr>
+          <w:rFonts w:ascii="Consolas" w:hAnsi="Consolas"/>
+          <w:color w:val="003366"/>
+          <w:sz w:val="18"/>
+        </w:rPr>
+        <w:t xml:space="preserve">  --stack-name hmsg-rac-prd \</w:t>
+      </w:r>
+    </w:p>
+    <w:p>
+      <w:pPr>
+        <w:spacing w:after="40"/>
+        <w:ind w:left="288"/>
+      </w:pPr>
+      <w:r>
+        <w:rPr>
+          <w:rFonts w:ascii="Consolas" w:hAnsi="Consolas"/>
+          <w:color w:val="003366"/>
+          <w:sz w:val="18"/>
+        </w:rPr>
+        <w:t xml:space="preserve">  --region eu-central-1 --profile haee \</w:t>
+      </w:r>
+    </w:p>
+    <w:p>
+      <w:pPr>
+        <w:spacing w:after="40"/>
+        <w:ind w:left="288"/>
+      </w:pPr>
+      <w:r>
+        <w:rPr>
+          <w:rFonts w:ascii="Consolas" w:hAnsi="Consolas"/>
+          <w:color w:val="003366"/>
+          <w:sz w:val="18"/>
+        </w:rPr>
+        <w:t xml:space="preserve">  --capabilities CAPABILITY_NAMED_IAM \</w:t>
+      </w:r>
+    </w:p>
+    <w:p>
+      <w:pPr>
+        <w:spacing w:after="40"/>
+        <w:ind w:left="288"/>
+      </w:pPr>
+      <w:r>
+        <w:rPr>
+          <w:rFonts w:ascii="Consolas" w:hAnsi="Consolas"/>
+          <w:color w:val="003366"/>
+          <w:sz w:val="18"/>
+        </w:rPr>
+        <w:t xml:space="preserve">  --parameter-overrides \</w:t>
+      </w:r>
+    </w:p>
+    <w:p>
+      <w:pPr>
+        <w:spacing w:after="40"/>
+        <w:ind w:left="288"/>
+      </w:pPr>
+      <w:r>
+        <w:rPr>
+          <w:rFonts w:ascii="Consolas" w:hAnsi="Consolas"/>
+          <w:color w:val="003366"/>
+          <w:sz w:val="18"/>
+        </w:rPr>
+        <w:t xml:space="preserve">    CustomerGatewayIp=&lt;on-prem-vpn-public-ip&gt; \</w:t>
+      </w:r>
+    </w:p>
+    <w:p>
+      <w:pPr>
+        <w:spacing w:after="40"/>
+        <w:ind w:left="288"/>
+      </w:pPr>
+      <w:r>
+        <w:rPr>
+          <w:rFonts w:ascii="Consolas" w:hAnsi="Consolas"/>
+          <w:color w:val="003366"/>
+          <w:sz w:val="18"/>
+        </w:rPr>
+        <w:t xml:space="preserve">    OnPremCidr=&lt;on-prem-network-cidr&gt;</w:t>
+      </w:r>
+    </w:p>
+    <w:p>
+      <w:pPr>
+        <w:pStyle w:val="Heading2"/>
+      </w:pPr>
+      <w:r>
+        <w:t>1.7 Teardown (full environment removal)</w:t>
+      </w:r>
+    </w:p>
+    <w:p>
+      <w:pPr>
+        <w:spacing w:after="120"/>
+      </w:pPr>
+      <w:r>
+        <w:t>MssqlInstance and SysadmSecret are protected by DeletionPolicy: Retain - stack deletion keeps both by design. For a complete cleanup, terminate the instance first, then delete the stack, then force-delete the secret.</w:t>
+      </w:r>
+    </w:p>
+    <w:p>
+      <w:pPr>
+        <w:spacing w:after="40"/>
+        <w:ind w:left="288"/>
+      </w:pPr>
+      <w:r>
+        <w:rPr>
+          <w:rFonts w:ascii="Consolas" w:hAnsi="Consolas"/>
+          <w:color w:val="003366"/>
+          <w:sz w:val="18"/>
+        </w:rPr>
+        <w:t>aws ec2 terminate-instances --instance-ids &lt;MssqlInstanceId&gt;</w:t>
+      </w:r>
+    </w:p>
+    <w:p>
+      <w:pPr>
+        <w:spacing w:after="40"/>
+        <w:ind w:left="288"/>
+      </w:pPr>
+      <w:r>
+        <w:rPr>
+          <w:rFonts w:ascii="Consolas" w:hAnsi="Consolas"/>
+          <w:color w:val="003366"/>
+          <w:sz w:val="18"/>
+        </w:rPr>
+        <w:t>aws cloudformation delete-stack --stack-name hmsg-rac-prd --region eu-central-1 --profile haee</w:t>
+      </w:r>
+    </w:p>
+    <w:p>
+      <w:pPr>
+        <w:spacing w:after="40"/>
+        <w:ind w:left="288"/>
+      </w:pPr>
+      <w:r>
+        <w:rPr>
+          <w:rFonts w:ascii="Consolas" w:hAnsi="Consolas"/>
+          <w:color w:val="003366"/>
+          <w:sz w:val="18"/>
+        </w:rPr>
+        <w:t>aws secretsmanager delete-secret --secret-id hmsg-rac-prd-sysadm-password --force-delete-without-recovery --region eu-central-1 --profile haee</w:t>
+      </w:r>
+    </w:p>
+    <w:p>
+      <w:pPr>
+        <w:spacing w:before="80"/>
+      </w:pPr>
+      <w:r>
+        <w:rPr>
+          <w:i/>
+          <w:color w:val="595959"/>
+          <w:sz w:val="20"/>
+        </w:rPr>
+        <w:t>Re-installing after teardown: re-import the same certificate (or regenerate the CA), recreate the key pair if deleted, and re-run sections 1.1-1.5.</w:t>
+      </w:r>
+    </w:p>
+    <w:p>
+      <w:pPr>
+        <w:pStyle w:val="Heading1"/>
+      </w:pPr>
+      <w:r>
+        <w:t>2. Purpose &amp; scope</w:t>
       </w:r>
     </w:p>
     <w:p>
@@ -447,7 +1531,7 @@
         <w:pStyle w:val="Heading1"/>
       </w:pPr>
       <w:r>
-        <w:t>2. Access paths</w:t>
+        <w:t>3. Access paths</w:t>
       </w:r>
     </w:p>
     <w:tbl>
@@ -752,7 +1836,7 @@
         <w:pStyle w:val="Heading1"/>
       </w:pPr>
       <w:r>
-        <w:t>3. Key resources</w:t>
+        <w:t>4. Key resources</w:t>
       </w:r>
     </w:p>
     <w:tbl>
@@ -1003,7 +2087,7 @@
         <w:pStyle w:val="Heading1"/>
       </w:pPr>
       <w:r>
-        <w:t>4. Operating rules</w:t>
+        <w:t>5. Operating rules</w:t>
       </w:r>
     </w:p>
     <w:p>
@@ -1083,7 +2167,7 @@
         <w:pStyle w:val="Heading1"/>
       </w:pPr>
       <w:r>
-        <w:t>5. Routine checks</w:t>
+        <w:t>6. Routine checks</w:t>
       </w:r>
     </w:p>
     <w:tbl>
@@ -1334,7 +2418,7 @@
         <w:pStyle w:val="Heading1"/>
       </w:pPr>
       <w:r>
-        <w:t>6. Handover</w:t>
+        <w:t>7. Handover</w:t>
       </w:r>
     </w:p>
     <w:p>

</xml_diff>